<commit_message>
Implementato header per login-logout
Aggiunte funzionalità di logout
Attivato sistema di login con pagina dedicata
Fix cookie authToken lato server e client
</commit_message>
<xml_diff>
--- a/to-backend/docx_examples/template_full_report.docx
+++ b/to-backend/docx_examples/template_full_report.docx
@@ -1007,77 +1007,6 @@
           <w:rFonts w:ascii="Arial" w:hAnsi="Arial" w:cs="Arial"/>
         </w:rPr>
       </w:pPr>
-    </w:p>
-    <w:p>
-      <w:pPr>
-        <w:rPr>
-          <w:rFonts w:ascii="Arial" w:hAnsi="Arial" w:cs="Arial"/>
-        </w:rPr>
-      </w:pPr>
-    </w:p>
-    <w:p>
-      <w:pPr>
-        <w:rPr>
-          <w:rFonts w:ascii="Arial" w:hAnsi="Arial" w:cs="Arial"/>
-        </w:rPr>
-      </w:pPr>
-      <w:r>
-        <w:rPr>
-          <w:rFonts w:ascii="Arial" w:hAnsi="Arial" w:cs="Arial"/>
-        </w:rPr>
-        <w:t xml:space="preserve">Il presente tagliando </w:t>
-      </w:r>
-      <w:r>
-        <w:rPr>
-          <w:rFonts w:ascii="Arial" w:hAnsi="Arial" w:cs="Arial"/>
-        </w:rPr>
-        <w:t xml:space="preserve">q</w:t>
-      </w:r>
-      <w:r>
-        <w:rPr>
-          <w:rFonts w:ascii="Arial" w:hAnsi="Arial" w:cs="Arial"/>
-        </w:rPr>
-        <w:t xml:space="preserve"/>
-      </w:r>
-      <w:r>
-        <w:rPr>
-          <w:rFonts w:ascii="Arial" w:hAnsi="Arial" w:cs="Arial"/>
-        </w:rPr>
-        <w:t xml:space="preserve"/>
-      </w:r>
-      <w:r>
-        <w:rPr>
-          <w:rFonts w:ascii="Arial" w:hAnsi="Arial" w:cs="Arial"/>
-        </w:rPr>
-        <w:t xml:space="preserve"> è stato rilasciato a </w:t>
-        <w:t xml:space="preserve">p</w:t>
-        <w:t xml:space="preserve"/>
-      </w:r>
-      <w:r>
-        <w:rPr>
-          <w:rFonts w:ascii="Arial" w:hAnsi="Arial" w:cs="Arial"/>
-        </w:rPr>
-        <w:t xml:space="preserve"/>
-      </w:r>
-      <w:r>
-        <w:rPr>
-          <w:rFonts w:ascii="Arial" w:hAnsi="Arial" w:cs="Arial"/>
-        </w:rPr>
-        <w:t xml:space="preserve"> </w:t>
-        <w:t xml:space="preserve">a</w:t>
-      </w:r>
-      <w:r>
-        <w:rPr>
-          <w:rFonts w:ascii="Arial" w:hAnsi="Arial" w:cs="Arial"/>
-        </w:rPr>
-        <w:t xml:space="preserve"/>
-      </w:r>
-      <w:r>
-        <w:rPr>
-          <w:rFonts w:ascii="Arial" w:hAnsi="Arial" w:cs="Arial"/>
-        </w:rPr>
-        <w:t xml:space="preserve"/>
-      </w:r>
     </w:p>
     <w:p>
       <w:pPr>

</xml_diff>